<commit_message>
Add CV PDFs for General and Technical profiles
- Created Deidine_CV_General_EN.pdf for general professional overview.
- Created Deidine_CV_Tech_EN.pdf focusing on technical skills and experience.
</commit_message>
<xml_diff>
--- a/cv/output/Deidine_CV_Tech_EN.docx
+++ b/cv/output/Deidine_CV_Tech_EN.docx
@@ -63,7 +63,7 @@
         <w:rPr>
           <w:sz w:val="21"/>
         </w:rPr>
-        <w:t>Software engineer with experience delivering full-stack web, mobile, and desktop applications across real estate, e-commerce, government, and fintech-adjacent projects. Skilled in React/Next.js, React Native, Spring Boot, and Python, with hands-on experience in AI integration (OpenAI SDK, RAG), cloud deployment (AWS, GCP), and both SQL and NoSQL database design.</w:t>
+        <w:t>Software engineer with experience delivering full-stack web, mobile, and desktop applications across real estate, e-commerce, government, and fintech-adjacent projects. Skilled in React/Next.js, React Native, Spring Boot, and Python, with hands-on experience in AI integration (OpenAI SDK, RAG), Kubernetes-based cloud deployment (AWS, GCP, Docker, Helm), OpenID Connect/SSO identity systems, and both SQL and NoSQL database design.</w:t>
       </w:r>
     </w:p>
     <w:p>
@@ -198,13 +198,31 @@
           <w:b/>
           <w:sz w:val="21"/>
         </w:rPr>
+        <w:t xml:space="preserve">Identity &amp; SSO: </w:t>
+      </w:r>
+      <w:r>
+        <w:rPr>
+          <w:sz w:val="21"/>
+        </w:rPr>
+        <w:t>OpenID Connect (OIDC), OAuth2, PKCE, Koa, oidc-provider, multi-service identity brokering</w:t>
+      </w:r>
+    </w:p>
+    <w:p>
+      <w:pPr>
+        <w:spacing w:after="40"/>
+      </w:pPr>
+      <w:r>
+        <w:rPr>
+          <w:b/>
+          <w:sz w:val="21"/>
+        </w:rPr>
         <w:t xml:space="preserve">Cloud &amp; DevOps: </w:t>
       </w:r>
       <w:r>
         <w:rPr>
           <w:sz w:val="21"/>
         </w:rPr>
-        <w:t>AWS, Google Cloud, Docker, CI/CD, Git</w:t>
+        <w:t>AWS, Google Cloud, Docker, Kubernetes, Helm, Nginx, Caddy, CI/CD, Git</w:t>
       </w:r>
     </w:p>
     <w:p>
@@ -496,6 +514,45 @@
         <w:rPr>
           <w:sz w:val="21"/>
         </w:rPr>
+        <w:t>Built and operate a custom OpenID Connect (OIDC) identity provider (Koa, oidc-provider, PKCE) so Khidmaty serves as the shared identity provider (SSO) for other Mauritanian government digital services.</w:t>
+      </w:r>
+    </w:p>
+    <w:p>
+      <w:pPr>
+        <w:pStyle w:val="ListBullet"/>
+        <w:spacing w:after="40"/>
+        <w:ind w:left="317"/>
+      </w:pPr>
+      <w:r>
+        <w:rPr>
+          <w:sz w:val="21"/>
+        </w:rPr>
+        <w:t>Led the full backend migration of Mauritania's Carte Grise (vehicle registration) system onto a Next.js API architecture with a complete certificate state-machine workflow, integrating it with both the Khidmaty and Houwity apps.</w:t>
+      </w:r>
+    </w:p>
+    <w:p>
+      <w:pPr>
+        <w:pStyle w:val="ListBullet"/>
+        <w:spacing w:after="40"/>
+        <w:ind w:left="317"/>
+      </w:pPr>
+      <w:r>
+        <w:rPr>
+          <w:sz w:val="21"/>
+        </w:rPr>
+        <w:t>Deploy and operate Kubernetes clusters (Docker, Helm charts) across multiple government projects, configuring SSL/HTTPS via Nginx and Caddy.</w:t>
+      </w:r>
+    </w:p>
+    <w:p>
+      <w:pPr>
+        <w:pStyle w:val="ListBullet"/>
+        <w:spacing w:after="40"/>
+        <w:ind w:left="317"/>
+      </w:pPr>
+      <w:r>
+        <w:rPr>
+          <w:sz w:val="21"/>
+        </w:rPr>
         <w:t>Administer the production database, including regular backups and data integrity checks.</w:t>
       </w:r>
     </w:p>
@@ -522,20 +579,7 @@
         <w:rPr>
           <w:sz w:val="21"/>
         </w:rPr>
-        <w:t>Triage and fix client-reported bugs and mobile app crashes/memory issues; upgrade dependencies and OS/SDK targets to the latest supported versions.</w:t>
-      </w:r>
-    </w:p>
-    <w:p>
-      <w:pPr>
-        <w:pStyle w:val="ListBullet"/>
-        <w:spacing w:after="40"/>
-        <w:ind w:left="317"/>
-      </w:pPr>
-      <w:r>
-        <w:rPr>
-          <w:sz w:val="21"/>
-        </w:rPr>
-        <w:t>Monitor the platform for security threats and apply security patches to protect user and government data.</w:t>
+        <w:t>Triage and fix client-reported bugs and mobile app crashes/memory issues; monitor the platform for security threats and apply patches; upgrade dependencies and OS/SDK targets to the latest supported versions.</w:t>
       </w:r>
     </w:p>
     <w:p>
@@ -587,6 +631,19 @@
           <w:sz w:val="21"/>
         </w:rPr>
         <w:t>Built and maintain the mobile app frontend for Houwity, a national registry platform equivalent to Mauritania's official ANRPTS portal (anrpts.gov.mr), giving citizens mobile access to the same registry services as the Khidmaty app.</w:t>
+      </w:r>
+    </w:p>
+    <w:p>
+      <w:pPr>
+        <w:pStyle w:val="ListBullet"/>
+        <w:spacing w:after="40"/>
+        <w:ind w:left="317"/>
+      </w:pPr>
+      <w:r>
+        <w:rPr>
+          <w:sz w:val="21"/>
+        </w:rPr>
+        <w:t>Connected Houwity to the migrated Carte Grise backend and the shared Khidmaty OIDC identity provider for unified authentication across registry services.</w:t>
       </w:r>
     </w:p>
     <w:p>

</xml_diff>